<commit_message>
docs(reports): complete Report 4 SDD and update BM03 record of changes
- Report 4: template heading format, class specifications for MF-01..MF-05,
  technology declaration (1.3), 17 state machine diagrams (2.1), Gemini and
  named external services, sequential figure numbers, fixed 3.1.3/3.2.3/3.2.4
- BM03: version 1.1 (27/10/2026), add changes 9-12 (interview/offer/start work,
  placement reconciliation, client ownership rule, job recommendations)
</commit_message>
<xml_diff>
--- a/docs/reports/review2/SWP490_FA26SE153_R2_BM03_Record_of_Changes.docx
+++ b/docs/reports/review2/SWP490_FA26SE153_R2_BM03_Record_of_Changes.docx
@@ -526,7 +526,7 @@
                 <w:sz w:val="19"/>
                 <w:szCs w:val="19"/>
               </w:rPr>
-              <w:t>1.0</w:t>
+              <w:t>1.1</w:t>
             </w:r>
           </w:p>
         </w:tc>
@@ -592,7 +592,7 @@
                 <w:sz w:val="19"/>
                 <w:szCs w:val="19"/>
               </w:rPr>
-              <w:t>23/10/2026</w:t>
+              <w:t>27/10/2026</w:t>
             </w:r>
           </w:p>
         </w:tc>
@@ -2360,6 +2360,758 @@
           </w:p>
         </w:tc>
       </w:tr>
+      <w:tr>
+        <w:tc>
+          <w:tcPr>
+            <w:tcW w:type="dxa" w:w="602"/>
+            <w:tcBorders>
+              <w:top w:val="single" w:color="D9D4CA" w:sz="4"/>
+              <w:left w:val="single" w:color="D9D4CA" w:sz="4"/>
+              <w:bottom w:val="single" w:color="D9D4CA" w:sz="4"/>
+              <w:right w:val="single" w:color="D9D4CA" w:sz="4"/>
+            </w:tcBorders>
+            <w:tcMar>
+              <w:top w:type="dxa" w:w="60"/>
+              <w:left w:type="dxa" w:w="80"/>
+              <w:bottom w:type="dxa" w:w="60"/>
+              <w:right w:type="dxa" w:w="80"/>
+            </w:tcMar>
+          </w:tcPr>
+          <w:p>
+            <w:r>
+              <w:rPr>
+                <w:rFonts w:ascii="Calibri" w:cs="Calibri" w:eastAsia="Calibri" w:hAnsi="Calibri"/>
+                <w:b w:val="false"/>
+                <w:bCs w:val="false"/>
+                <w:i w:val="false"/>
+                <w:iCs w:val="false"/>
+                <w:sz w:val="19"/>
+                <w:szCs w:val="19"/>
+              </w:rPr>
+              <w:t>9</w:t>
+            </w:r>
+          </w:p>
+        </w:tc>
+        <w:tc>
+          <w:tcPr>
+            <w:tcW w:type="dxa" w:w="1204"/>
+            <w:tcBorders>
+              <w:top w:val="single" w:color="D9D4CA" w:sz="4"/>
+              <w:left w:val="single" w:color="D9D4CA" w:sz="4"/>
+              <w:bottom w:val="single" w:color="D9D4CA" w:sz="4"/>
+              <w:right w:val="single" w:color="D9D4CA" w:sz="4"/>
+            </w:tcBorders>
+            <w:tcMar>
+              <w:top w:type="dxa" w:w="60"/>
+              <w:left w:type="dxa" w:w="80"/>
+              <w:bottom w:type="dxa" w:w="60"/>
+              <w:right w:type="dxa" w:w="80"/>
+            </w:tcMar>
+          </w:tcPr>
+          <w:p>
+            <w:r>
+              <w:rPr>
+                <w:rFonts w:ascii="Calibri" w:cs="Calibri" w:eastAsia="Calibri" w:hAnsi="Calibri"/>
+                <w:b w:val="false"/>
+                <w:bCs w:val="false"/>
+                <w:i w:val="false"/>
+                <w:iCs w:val="false"/>
+                <w:sz w:val="19"/>
+                <w:szCs w:val="19"/>
+              </w:rPr>
+              <w:t>3.2.c Workflow &amp; Interview</w:t>
+            </w:r>
+          </w:p>
+        </w:tc>
+        <w:tc>
+          <w:tcPr>
+            <w:tcW w:type="dxa" w:w="2409"/>
+            <w:tcBorders>
+              <w:top w:val="single" w:color="D9D4CA" w:sz="4"/>
+              <w:left w:val="single" w:color="D9D4CA" w:sz="4"/>
+              <w:bottom w:val="single" w:color="D9D4CA" w:sz="4"/>
+              <w:right w:val="single" w:color="D9D4CA" w:sz="4"/>
+            </w:tcBorders>
+            <w:tcMar>
+              <w:top w:type="dxa" w:w="60"/>
+              <w:left w:type="dxa" w:w="80"/>
+              <w:bottom w:type="dxa" w:w="60"/>
+              <w:right w:type="dxa" w:w="80"/>
+            </w:tcMar>
+          </w:tcPr>
+          <w:p>
+            <w:r>
+              <w:rPr>
+                <w:rFonts w:ascii="Calibri" w:cs="Calibri" w:eastAsia="Calibri" w:hAnsi="Calibri"/>
+                <w:b w:val="false"/>
+                <w:bCs w:val="false"/>
+                <w:i w:val="false"/>
+                <w:iCs w:val="false"/>
+                <w:sz w:val="19"/>
+                <w:szCs w:val="19"/>
+              </w:rPr>
+              <w:t>Interview scheduling and outcome notes (Pass / Fail / Backup).</w:t>
+            </w:r>
+          </w:p>
+        </w:tc>
+        <w:tc>
+          <w:tcPr>
+            <w:tcW w:type="dxa" w:w="2409"/>
+            <w:tcBorders>
+              <w:top w:val="single" w:color="D9D4CA" w:sz="4"/>
+              <w:left w:val="single" w:color="D9D4CA" w:sz="4"/>
+              <w:bottom w:val="single" w:color="D9D4CA" w:sz="4"/>
+              <w:right w:val="single" w:color="D9D4CA" w:sz="4"/>
+            </w:tcBorders>
+            <w:tcMar>
+              <w:top w:type="dxa" w:w="60"/>
+              <w:left w:type="dxa" w:w="80"/>
+              <w:bottom w:type="dxa" w:w="60"/>
+              <w:right w:type="dxa" w:w="80"/>
+            </w:tcMar>
+          </w:tcPr>
+          <w:p>
+            <w:r>
+              <w:rPr>
+                <w:rFonts w:ascii="Calibri" w:cs="Calibri" w:eastAsia="Calibri" w:hAnsi="Calibri"/>
+                <w:b w:val="false"/>
+                <w:bCs w:val="false"/>
+                <w:i w:val="false"/>
+                <w:iCs w:val="false"/>
+                <w:sz w:val="19"/>
+                <w:szCs w:val="19"/>
+              </w:rPr>
+              <w:t>Interview rounds with reschedule/cancel history and NO_SHOW; versioned offers (HEADHUNT_COD must use gross monthly salary, withdrawal needs a reason, offers expire); start-work confirmation creating the Placement, or "not started" with no fee.</w:t>
+            </w:r>
+          </w:p>
+        </w:tc>
+        <w:tc>
+          <w:tcPr>
+            <w:tcW w:type="dxa" w:w="1807"/>
+            <w:tcBorders>
+              <w:top w:val="single" w:color="D9D4CA" w:sz="4"/>
+              <w:left w:val="single" w:color="D9D4CA" w:sz="4"/>
+              <w:bottom w:val="single" w:color="D9D4CA" w:sz="4"/>
+              <w:right w:val="single" w:color="D9D4CA" w:sz="4"/>
+            </w:tcBorders>
+            <w:tcMar>
+              <w:top w:type="dxa" w:w="60"/>
+              <w:left w:type="dxa" w:w="80"/>
+              <w:bottom w:type="dxa" w:w="60"/>
+              <w:right w:type="dxa" w:w="80"/>
+            </w:tcMar>
+          </w:tcPr>
+          <w:p>
+            <w:r>
+              <w:rPr>
+                <w:rFonts w:ascii="Calibri" w:cs="Calibri" w:eastAsia="Calibri" w:hAnsi="Calibri"/>
+                <w:b w:val="false"/>
+                <w:bCs w:val="false"/>
+                <w:i w:val="false"/>
+                <w:iCs w:val="false"/>
+                <w:sz w:val="19"/>
+                <w:szCs w:val="19"/>
+              </w:rPr>
+              <w:t>Iteration 1: the hiring outcome between interview and placement must be recorded to trigger fees, warranty and commission.</w:t>
+            </w:r>
+          </w:p>
+        </w:tc>
+        <w:tc>
+          <w:tcPr>
+            <w:tcW w:type="dxa" w:w="1207"/>
+            <w:tcBorders>
+              <w:top w:val="single" w:color="D9D4CA" w:sz="4"/>
+              <w:left w:val="single" w:color="D9D4CA" w:sz="4"/>
+              <w:bottom w:val="single" w:color="D9D4CA" w:sz="4"/>
+              <w:right w:val="single" w:color="D9D4CA" w:sz="4"/>
+            </w:tcBorders>
+            <w:tcMar>
+              <w:top w:type="dxa" w:w="60"/>
+              <w:left w:type="dxa" w:w="80"/>
+              <w:bottom w:type="dxa" w:w="60"/>
+              <w:right w:type="dxa" w:w="80"/>
+            </w:tcMar>
+          </w:tcPr>
+          <w:p>
+            <w:r>
+              <w:rPr>
+                <w:rFonts w:ascii="Calibri" w:cs="Calibri" w:eastAsia="Calibri" w:hAnsi="Calibri"/>
+                <w:b w:val="false"/>
+                <w:bCs w:val="false"/>
+                <w:i w:val="false"/>
+                <w:iCs w:val="false"/>
+                <w:sz w:val="19"/>
+                <w:szCs w:val="19"/>
+              </w:rPr>
+              <w:t>Khúc Ngọc Sơn</w:t>
+            </w:r>
+          </w:p>
+        </w:tc>
+      </w:tr>
+      <w:tr>
+        <w:tc>
+          <w:tcPr>
+            <w:tcW w:type="dxa" w:w="602"/>
+            <w:tcBorders>
+              <w:top w:val="single" w:color="D9D4CA" w:sz="4"/>
+              <w:left w:val="single" w:color="D9D4CA" w:sz="4"/>
+              <w:bottom w:val="single" w:color="D9D4CA" w:sz="4"/>
+              <w:right w:val="single" w:color="D9D4CA" w:sz="4"/>
+            </w:tcBorders>
+            <w:tcMar>
+              <w:top w:type="dxa" w:w="60"/>
+              <w:left w:type="dxa" w:w="80"/>
+              <w:bottom w:type="dxa" w:w="60"/>
+              <w:right w:type="dxa" w:w="80"/>
+            </w:tcMar>
+          </w:tcPr>
+          <w:p>
+            <w:r>
+              <w:rPr>
+                <w:rFonts w:ascii="Calibri" w:cs="Calibri" w:eastAsia="Calibri" w:hAnsi="Calibri"/>
+                <w:b w:val="false"/>
+                <w:bCs w:val="false"/>
+                <w:i w:val="false"/>
+                <w:iCs w:val="false"/>
+                <w:sz w:val="19"/>
+                <w:szCs w:val="19"/>
+              </w:rPr>
+              <w:t>10</w:t>
+            </w:r>
+          </w:p>
+        </w:tc>
+        <w:tc>
+          <w:tcPr>
+            <w:tcW w:type="dxa" w:w="1204"/>
+            <w:tcBorders>
+              <w:top w:val="single" w:color="D9D4CA" w:sz="4"/>
+              <w:left w:val="single" w:color="D9D4CA" w:sz="4"/>
+              <w:bottom w:val="single" w:color="D9D4CA" w:sz="4"/>
+              <w:right w:val="single" w:color="D9D4CA" w:sz="4"/>
+            </w:tcBorders>
+            <w:tcMar>
+              <w:top w:type="dxa" w:w="60"/>
+              <w:left w:type="dxa" w:w="80"/>
+              <w:bottom w:type="dxa" w:w="60"/>
+              <w:right w:type="dxa" w:w="80"/>
+            </w:tcMar>
+          </w:tcPr>
+          <w:p>
+            <w:r>
+              <w:rPr>
+                <w:rFonts w:ascii="Calibri" w:cs="Calibri" w:eastAsia="Calibri" w:hAnsi="Calibri"/>
+                <w:b w:val="false"/>
+                <w:bCs w:val="false"/>
+                <w:i w:val="false"/>
+                <w:iCs w:val="false"/>
+                <w:sz w:val="19"/>
+                <w:szCs w:val="19"/>
+              </w:rPr>
+              <w:t>3.2.c Workflow &amp; Interview; Partner &amp; Finance (new)</w:t>
+            </w:r>
+          </w:p>
+        </w:tc>
+        <w:tc>
+          <w:tcPr>
+            <w:tcW w:type="dxa" w:w="2409"/>
+            <w:tcBorders>
+              <w:top w:val="single" w:color="D9D4CA" w:sz="4"/>
+              <w:left w:val="single" w:color="D9D4CA" w:sz="4"/>
+              <w:bottom w:val="single" w:color="D9D4CA" w:sz="4"/>
+              <w:right w:val="single" w:color="D9D4CA" w:sz="4"/>
+            </w:tcBorders>
+            <w:tcMar>
+              <w:top w:type="dxa" w:w="60"/>
+              <w:left w:type="dxa" w:w="80"/>
+              <w:bottom w:type="dxa" w:w="60"/>
+              <w:right w:type="dxa" w:w="80"/>
+            </w:tcMar>
+          </w:tcPr>
+          <w:p>
+            <w:r>
+              <w:rPr>
+                <w:rFonts w:ascii="Calibri" w:cs="Calibri" w:eastAsia="Calibri" w:hAnsi="Calibri"/>
+                <w:b w:val="false"/>
+                <w:bCs w:val="false"/>
+                <w:i w:val="false"/>
+                <w:iCs w:val="false"/>
+                <w:sz w:val="19"/>
+                <w:szCs w:val="19"/>
+              </w:rPr>
+              <w:t>—</w:t>
+            </w:r>
+          </w:p>
+        </w:tc>
+        <w:tc>
+          <w:tcPr>
+            <w:tcW w:type="dxa" w:w="2409"/>
+            <w:tcBorders>
+              <w:top w:val="single" w:color="D9D4CA" w:sz="4"/>
+              <w:left w:val="single" w:color="D9D4CA" w:sz="4"/>
+              <w:bottom w:val="single" w:color="D9D4CA" w:sz="4"/>
+              <w:right w:val="single" w:color="D9D4CA" w:sz="4"/>
+            </w:tcBorders>
+            <w:tcMar>
+              <w:top w:type="dxa" w:w="60"/>
+              <w:left w:type="dxa" w:w="80"/>
+              <w:bottom w:type="dxa" w:w="60"/>
+              <w:right w:type="dxa" w:w="80"/>
+            </w:tcMar>
+          </w:tcPr>
+          <w:p>
+            <w:r>
+              <w:rPr>
+                <w:rFonts w:ascii="Calibri" w:cs="Calibri" w:eastAsia="Calibri" w:hAnsi="Calibri"/>
+                <w:b w:val="false"/>
+                <w:bCs w:val="false"/>
+                <w:i w:val="false"/>
+                <w:iCs w:val="false"/>
+                <w:sz w:val="19"/>
+                <w:szCs w:val="19"/>
+              </w:rPr>
+              <w:t>Placement reconciliation for HEADHUNT_COD: Internal HR verifies the start-work outcome reported by the Client (PENDING → CONFIRMED / FLAGGED); the service fee becomes DUE only after CONFIRMED; Platform Admin resolves FLAGGED cases.</w:t>
+            </w:r>
+          </w:p>
+        </w:tc>
+        <w:tc>
+          <w:tcPr>
+            <w:tcW w:type="dxa" w:w="1807"/>
+            <w:tcBorders>
+              <w:top w:val="single" w:color="D9D4CA" w:sz="4"/>
+              <w:left w:val="single" w:color="D9D4CA" w:sz="4"/>
+              <w:bottom w:val="single" w:color="D9D4CA" w:sz="4"/>
+              <w:right w:val="single" w:color="D9D4CA" w:sz="4"/>
+            </w:tcBorders>
+            <w:tcMar>
+              <w:top w:type="dxa" w:w="60"/>
+              <w:left w:type="dxa" w:w="80"/>
+              <w:bottom w:type="dxa" w:w="60"/>
+              <w:right w:type="dxa" w:w="80"/>
+            </w:tcMar>
+          </w:tcPr>
+          <w:p>
+            <w:r>
+              <w:rPr>
+                <w:rFonts w:ascii="Calibri" w:cs="Calibri" w:eastAsia="Calibri" w:hAnsi="Calibri"/>
+                <w:b w:val="false"/>
+                <w:bCs w:val="false"/>
+                <w:i w:val="false"/>
+                <w:iCs w:val="false"/>
+                <w:sz w:val="19"/>
+                <w:szCs w:val="19"/>
+              </w:rPr>
+              <w:t>Iteration 1 / partner constraint: fees and commissions must not rely only on the Client's own report of the hire.</w:t>
+            </w:r>
+          </w:p>
+        </w:tc>
+        <w:tc>
+          <w:tcPr>
+            <w:tcW w:type="dxa" w:w="1207"/>
+            <w:tcBorders>
+              <w:top w:val="single" w:color="D9D4CA" w:sz="4"/>
+              <w:left w:val="single" w:color="D9D4CA" w:sz="4"/>
+              <w:bottom w:val="single" w:color="D9D4CA" w:sz="4"/>
+              <w:right w:val="single" w:color="D9D4CA" w:sz="4"/>
+            </w:tcBorders>
+            <w:tcMar>
+              <w:top w:type="dxa" w:w="60"/>
+              <w:left w:type="dxa" w:w="80"/>
+              <w:bottom w:type="dxa" w:w="60"/>
+              <w:right w:type="dxa" w:w="80"/>
+            </w:tcMar>
+          </w:tcPr>
+          <w:p>
+            <w:r>
+              <w:rPr>
+                <w:rFonts w:ascii="Calibri" w:cs="Calibri" w:eastAsia="Calibri" w:hAnsi="Calibri"/>
+                <w:b w:val="false"/>
+                <w:bCs w:val="false"/>
+                <w:i w:val="false"/>
+                <w:iCs w:val="false"/>
+                <w:sz w:val="19"/>
+                <w:szCs w:val="19"/>
+              </w:rPr>
+              <w:t>Khúc Ngọc Sơn</w:t>
+            </w:r>
+          </w:p>
+        </w:tc>
+      </w:tr>
+      <w:tr>
+        <w:tc>
+          <w:tcPr>
+            <w:tcW w:type="dxa" w:w="602"/>
+            <w:tcBorders>
+              <w:top w:val="single" w:color="D9D4CA" w:sz="4"/>
+              <w:left w:val="single" w:color="D9D4CA" w:sz="4"/>
+              <w:bottom w:val="single" w:color="D9D4CA" w:sz="4"/>
+              <w:right w:val="single" w:color="D9D4CA" w:sz="4"/>
+            </w:tcBorders>
+            <w:tcMar>
+              <w:top w:type="dxa" w:w="60"/>
+              <w:left w:type="dxa" w:w="80"/>
+              <w:bottom w:type="dxa" w:w="60"/>
+              <w:right w:type="dxa" w:w="80"/>
+            </w:tcMar>
+          </w:tcPr>
+          <w:p>
+            <w:r>
+              <w:rPr>
+                <w:rFonts w:ascii="Calibri" w:cs="Calibri" w:eastAsia="Calibri" w:hAnsi="Calibri"/>
+                <w:b w:val="false"/>
+                <w:bCs w:val="false"/>
+                <w:i w:val="false"/>
+                <w:iCs w:val="false"/>
+                <w:sz w:val="19"/>
+                <w:szCs w:val="19"/>
+              </w:rPr>
+              <w:t>11</w:t>
+            </w:r>
+          </w:p>
+        </w:tc>
+        <w:tc>
+          <w:tcPr>
+            <w:tcW w:type="dxa" w:w="1204"/>
+            <w:tcBorders>
+              <w:top w:val="single" w:color="D9D4CA" w:sz="4"/>
+              <w:left w:val="single" w:color="D9D4CA" w:sz="4"/>
+              <w:bottom w:val="single" w:color="D9D4CA" w:sz="4"/>
+              <w:right w:val="single" w:color="D9D4CA" w:sz="4"/>
+            </w:tcBorders>
+            <w:tcMar>
+              <w:top w:type="dxa" w:w="60"/>
+              <w:left w:type="dxa" w:w="80"/>
+              <w:bottom w:type="dxa" w:w="60"/>
+              <w:right w:type="dxa" w:w="80"/>
+            </w:tcMar>
+          </w:tcPr>
+          <w:p>
+            <w:r>
+              <w:rPr>
+                <w:rFonts w:ascii="Calibri" w:cs="Calibri" w:eastAsia="Calibri" w:hAnsi="Calibri"/>
+                <w:b w:val="false"/>
+                <w:bCs w:val="false"/>
+                <w:i w:val="false"/>
+                <w:iCs w:val="false"/>
+                <w:sz w:val="19"/>
+                <w:szCs w:val="19"/>
+              </w:rPr>
+              <w:t>3.2.c Application &amp; CV Management</w:t>
+            </w:r>
+          </w:p>
+        </w:tc>
+        <w:tc>
+          <w:tcPr>
+            <w:tcW w:type="dxa" w:w="2409"/>
+            <w:tcBorders>
+              <w:top w:val="single" w:color="D9D4CA" w:sz="4"/>
+              <w:left w:val="single" w:color="D9D4CA" w:sz="4"/>
+              <w:bottom w:val="single" w:color="D9D4CA" w:sz="4"/>
+              <w:right w:val="single" w:color="D9D4CA" w:sz="4"/>
+            </w:tcBorders>
+            <w:tcMar>
+              <w:top w:type="dxa" w:w="60"/>
+              <w:left w:type="dxa" w:w="80"/>
+              <w:bottom w:type="dxa" w:w="60"/>
+              <w:right w:type="dxa" w:w="80"/>
+            </w:tcMar>
+          </w:tcPr>
+          <w:p>
+            <w:r>
+              <w:rPr>
+                <w:rFonts w:ascii="Calibri" w:cs="Calibri" w:eastAsia="Calibri" w:hAnsi="Calibri"/>
+                <w:b w:val="false"/>
+                <w:bCs w:val="false"/>
+                <w:i w:val="false"/>
+                <w:iCs w:val="false"/>
+                <w:sz w:val="19"/>
+                <w:szCs w:val="19"/>
+              </w:rPr>
+              <w:t>Automatic duplicate check by email/phone.</w:t>
+            </w:r>
+          </w:p>
+        </w:tc>
+        <w:tc>
+          <w:tcPr>
+            <w:tcW w:type="dxa" w:w="2409"/>
+            <w:tcBorders>
+              <w:top w:val="single" w:color="D9D4CA" w:sz="4"/>
+              <w:left w:val="single" w:color="D9D4CA" w:sz="4"/>
+              <w:bottom w:val="single" w:color="D9D4CA" w:sz="4"/>
+              <w:right w:val="single" w:color="D9D4CA" w:sz="4"/>
+            </w:tcBorders>
+            <w:tcMar>
+              <w:top w:type="dxa" w:w="60"/>
+              <w:left w:type="dxa" w:w="80"/>
+              <w:bottom w:type="dxa" w:w="60"/>
+              <w:right w:type="dxa" w:w="80"/>
+            </w:tcMar>
+          </w:tcPr>
+          <w:p>
+            <w:r>
+              <w:rPr>
+                <w:rFonts w:ascii="Calibri" w:cs="Calibri" w:eastAsia="Calibri" w:hAnsi="Calibri"/>
+                <w:b w:val="false"/>
+                <w:bCs w:val="false"/>
+                <w:i w:val="false"/>
+                <w:iCs w:val="false"/>
+                <w:sz w:val="19"/>
+                <w:szCs w:val="19"/>
+              </w:rPr>
+              <w:t>A candidate the Client already hired or processed within a configurable period (mf02.client_ownership_days, default 30) is blocked as CANDIDATE_OWNED_BY_CLIENT, so no affiliate commission is created for it.</w:t>
+            </w:r>
+          </w:p>
+        </w:tc>
+        <w:tc>
+          <w:tcPr>
+            <w:tcW w:type="dxa" w:w="1807"/>
+            <w:tcBorders>
+              <w:top w:val="single" w:color="D9D4CA" w:sz="4"/>
+              <w:left w:val="single" w:color="D9D4CA" w:sz="4"/>
+              <w:bottom w:val="single" w:color="D9D4CA" w:sz="4"/>
+              <w:right w:val="single" w:color="D9D4CA" w:sz="4"/>
+            </w:tcBorders>
+            <w:tcMar>
+              <w:top w:type="dxa" w:w="60"/>
+              <w:left w:type="dxa" w:w="80"/>
+              <w:bottom w:type="dxa" w:w="60"/>
+              <w:right w:type="dxa" w:w="80"/>
+            </w:tcMar>
+          </w:tcPr>
+          <w:p>
+            <w:r>
+              <w:rPr>
+                <w:rFonts w:ascii="Calibri" w:cs="Calibri" w:eastAsia="Calibri" w:hAnsi="Calibri"/>
+                <w:b w:val="false"/>
+                <w:bCs w:val="false"/>
+                <w:i w:val="false"/>
+                <w:iCs w:val="false"/>
+                <w:sz w:val="19"/>
+                <w:szCs w:val="19"/>
+              </w:rPr>
+              <w:t>Partner requirement: avoid paying commission for candidates the Client already owns.</w:t>
+            </w:r>
+          </w:p>
+        </w:tc>
+        <w:tc>
+          <w:tcPr>
+            <w:tcW w:type="dxa" w:w="1207"/>
+            <w:tcBorders>
+              <w:top w:val="single" w:color="D9D4CA" w:sz="4"/>
+              <w:left w:val="single" w:color="D9D4CA" w:sz="4"/>
+              <w:bottom w:val="single" w:color="D9D4CA" w:sz="4"/>
+              <w:right w:val="single" w:color="D9D4CA" w:sz="4"/>
+            </w:tcBorders>
+            <w:tcMar>
+              <w:top w:type="dxa" w:w="60"/>
+              <w:left w:type="dxa" w:w="80"/>
+              <w:bottom w:type="dxa" w:w="60"/>
+              <w:right w:type="dxa" w:w="80"/>
+            </w:tcMar>
+          </w:tcPr>
+          <w:p>
+            <w:r>
+              <w:rPr>
+                <w:rFonts w:ascii="Calibri" w:cs="Calibri" w:eastAsia="Calibri" w:hAnsi="Calibri"/>
+                <w:b w:val="false"/>
+                <w:bCs w:val="false"/>
+                <w:i w:val="false"/>
+                <w:iCs w:val="false"/>
+                <w:sz w:val="19"/>
+                <w:szCs w:val="19"/>
+              </w:rPr>
+              <w:t>Cao Hữu Trí</w:t>
+            </w:r>
+          </w:p>
+        </w:tc>
+      </w:tr>
+      <w:tr>
+        <w:tc>
+          <w:tcPr>
+            <w:tcW w:type="dxa" w:w="602"/>
+            <w:tcBorders>
+              <w:top w:val="single" w:color="D9D4CA" w:sz="4"/>
+              <w:left w:val="single" w:color="D9D4CA" w:sz="4"/>
+              <w:bottom w:val="single" w:color="D9D4CA" w:sz="4"/>
+              <w:right w:val="single" w:color="D9D4CA" w:sz="4"/>
+            </w:tcBorders>
+            <w:tcMar>
+              <w:top w:type="dxa" w:w="60"/>
+              <w:left w:type="dxa" w:w="80"/>
+              <w:bottom w:type="dxa" w:w="60"/>
+              <w:right w:type="dxa" w:w="80"/>
+            </w:tcMar>
+          </w:tcPr>
+          <w:p>
+            <w:r>
+              <w:rPr>
+                <w:rFonts w:ascii="Calibri" w:cs="Calibri" w:eastAsia="Calibri" w:hAnsi="Calibri"/>
+                <w:b w:val="false"/>
+                <w:bCs w:val="false"/>
+                <w:i w:val="false"/>
+                <w:iCs w:val="false"/>
+                <w:sz w:val="19"/>
+                <w:szCs w:val="19"/>
+              </w:rPr>
+              <w:t>12</w:t>
+            </w:r>
+          </w:p>
+        </w:tc>
+        <w:tc>
+          <w:tcPr>
+            <w:tcW w:type="dxa" w:w="1204"/>
+            <w:tcBorders>
+              <w:top w:val="single" w:color="D9D4CA" w:sz="4"/>
+              <w:left w:val="single" w:color="D9D4CA" w:sz="4"/>
+              <w:bottom w:val="single" w:color="D9D4CA" w:sz="4"/>
+              <w:right w:val="single" w:color="D9D4CA" w:sz="4"/>
+            </w:tcBorders>
+            <w:tcMar>
+              <w:top w:type="dxa" w:w="60"/>
+              <w:left w:type="dxa" w:w="80"/>
+              <w:bottom w:type="dxa" w:w="60"/>
+              <w:right w:type="dxa" w:w="80"/>
+            </w:tcMar>
+          </w:tcPr>
+          <w:p>
+            <w:r>
+              <w:rPr>
+                <w:rFonts w:ascii="Calibri" w:cs="Calibri" w:eastAsia="Calibri" w:hAnsi="Calibri"/>
+                <w:b w:val="false"/>
+                <w:bCs w:val="false"/>
+                <w:i w:val="false"/>
+                <w:iCs w:val="false"/>
+                <w:sz w:val="19"/>
+                <w:szCs w:val="19"/>
+              </w:rPr>
+              <w:t>3.2.b Candidate; 3.2.c AI Matching Engine</w:t>
+            </w:r>
+          </w:p>
+        </w:tc>
+        <w:tc>
+          <w:tcPr>
+            <w:tcW w:type="dxa" w:w="2409"/>
+            <w:tcBorders>
+              <w:top w:val="single" w:color="D9D4CA" w:sz="4"/>
+              <w:left w:val="single" w:color="D9D4CA" w:sz="4"/>
+              <w:bottom w:val="single" w:color="D9D4CA" w:sz="4"/>
+              <w:right w:val="single" w:color="D9D4CA" w:sz="4"/>
+            </w:tcBorders>
+            <w:tcMar>
+              <w:top w:type="dxa" w:w="60"/>
+              <w:left w:type="dxa" w:w="80"/>
+              <w:bottom w:type="dxa" w:w="60"/>
+              <w:right w:type="dxa" w:w="80"/>
+            </w:tcMar>
+          </w:tcPr>
+          <w:p>
+            <w:r>
+              <w:rPr>
+                <w:rFonts w:ascii="Calibri" w:cs="Calibri" w:eastAsia="Calibri" w:hAnsi="Calibri"/>
+                <w:b w:val="false"/>
+                <w:bCs w:val="false"/>
+                <w:i w:val="false"/>
+                <w:iCs w:val="false"/>
+                <w:sz w:val="19"/>
+                <w:szCs w:val="19"/>
+              </w:rPr>
+              <w:t>Candidate receives AI-generated job-fit notifications.</w:t>
+            </w:r>
+          </w:p>
+        </w:tc>
+        <w:tc>
+          <w:tcPr>
+            <w:tcW w:type="dxa" w:w="2409"/>
+            <w:tcBorders>
+              <w:top w:val="single" w:color="D9D4CA" w:sz="4"/>
+              <w:left w:val="single" w:color="D9D4CA" w:sz="4"/>
+              <w:bottom w:val="single" w:color="D9D4CA" w:sz="4"/>
+              <w:right w:val="single" w:color="D9D4CA" w:sz="4"/>
+            </w:tcBorders>
+            <w:tcMar>
+              <w:top w:type="dxa" w:w="60"/>
+              <w:left w:type="dxa" w:w="80"/>
+              <w:bottom w:type="dxa" w:w="60"/>
+              <w:right w:type="dxa" w:w="80"/>
+            </w:tcMar>
+          </w:tcPr>
+          <w:p>
+            <w:r>
+              <w:rPr>
+                <w:rFonts w:ascii="Calibri" w:cs="Calibri" w:eastAsia="Calibri" w:hAnsi="Calibri"/>
+                <w:b w:val="false"/>
+                <w:bCs w:val="false"/>
+                <w:i w:val="false"/>
+                <w:iCs w:val="false"/>
+                <w:sz w:val="19"/>
+                <w:szCs w:val="19"/>
+              </w:rPr>
+              <w:t>Explainable job recommendations: active jobs are ranked for a candidate from the public profile and primary CV using the AI v2 semantic-match service; a JOB_FIT notification is sent; private profiles see an empty state.</w:t>
+            </w:r>
+          </w:p>
+        </w:tc>
+        <w:tc>
+          <w:tcPr>
+            <w:tcW w:type="dxa" w:w="1807"/>
+            <w:tcBorders>
+              <w:top w:val="single" w:color="D9D4CA" w:sz="4"/>
+              <w:left w:val="single" w:color="D9D4CA" w:sz="4"/>
+              <w:bottom w:val="single" w:color="D9D4CA" w:sz="4"/>
+              <w:right w:val="single" w:color="D9D4CA" w:sz="4"/>
+            </w:tcBorders>
+            <w:tcMar>
+              <w:top w:type="dxa" w:w="60"/>
+              <w:left w:type="dxa" w:w="80"/>
+              <w:bottom w:type="dxa" w:w="60"/>
+              <w:right w:type="dxa" w:w="80"/>
+            </w:tcMar>
+          </w:tcPr>
+          <w:p>
+            <w:r>
+              <w:rPr>
+                <w:rFonts w:ascii="Calibri" w:cs="Calibri" w:eastAsia="Calibri" w:hAnsi="Calibri"/>
+                <w:b w:val="false"/>
+                <w:bCs w:val="false"/>
+                <w:i w:val="false"/>
+                <w:iCs w:val="false"/>
+                <w:sz w:val="19"/>
+                <w:szCs w:val="19"/>
+              </w:rPr>
+              <w:t>Iteration 1: notification alone was not useful without the reason a job fits; candidate privacy setting must be respected.</w:t>
+            </w:r>
+          </w:p>
+        </w:tc>
+        <w:tc>
+          <w:tcPr>
+            <w:tcW w:type="dxa" w:w="1207"/>
+            <w:tcBorders>
+              <w:top w:val="single" w:color="D9D4CA" w:sz="4"/>
+              <w:left w:val="single" w:color="D9D4CA" w:sz="4"/>
+              <w:bottom w:val="single" w:color="D9D4CA" w:sz="4"/>
+              <w:right w:val="single" w:color="D9D4CA" w:sz="4"/>
+            </w:tcBorders>
+            <w:tcMar>
+              <w:top w:type="dxa" w:w="60"/>
+              <w:left w:type="dxa" w:w="80"/>
+              <w:bottom w:type="dxa" w:w="60"/>
+              <w:right w:type="dxa" w:w="80"/>
+            </w:tcMar>
+          </w:tcPr>
+          <w:p>
+            <w:r>
+              <w:rPr>
+                <w:rFonts w:ascii="Calibri" w:cs="Calibri" w:eastAsia="Calibri" w:hAnsi="Calibri"/>
+                <w:b w:val="false"/>
+                <w:bCs w:val="false"/>
+                <w:i w:val="false"/>
+                <w:iCs w:val="false"/>
+                <w:sz w:val="19"/>
+                <w:szCs w:val="19"/>
+              </w:rPr>
+              <w:t>Trương Hoàng Quí</w:t>
+            </w:r>
+          </w:p>
+        </w:tc>
+      </w:tr>
     </w:tbl>
     <w:p>
       <w:pPr>
@@ -3179,6 +3931,378 @@
                 <w:szCs w:val="19"/>
               </w:rPr>
               <w:t>8</w:t>
+            </w:r>
+          </w:p>
+        </w:tc>
+        <w:tc>
+          <w:tcPr>
+            <w:tcW w:type="dxa" w:w="3212"/>
+            <w:tcBorders>
+              <w:top w:val="single" w:color="D9D4CA" w:sz="4"/>
+              <w:left w:val="single" w:color="D9D4CA" w:sz="4"/>
+              <w:bottom w:val="single" w:color="D9D4CA" w:sz="4"/>
+              <w:right w:val="single" w:color="D9D4CA" w:sz="4"/>
+            </w:tcBorders>
+            <w:tcMar>
+              <w:top w:type="dxa" w:w="60"/>
+              <w:left w:type="dxa" w:w="80"/>
+              <w:bottom w:type="dxa" w:w="60"/>
+              <w:right w:type="dxa" w:w="80"/>
+            </w:tcMar>
+          </w:tcPr>
+          <w:p>
+            <w:r>
+              <w:rPr>
+                <w:rFonts w:ascii="Calibri" w:cs="Calibri" w:eastAsia="Calibri" w:hAnsi="Calibri"/>
+                <w:b w:val="false"/>
+                <w:bCs w:val="false"/>
+                <w:i w:val="false"/>
+                <w:iCs w:val="false"/>
+                <w:sz w:val="19"/>
+                <w:szCs w:val="19"/>
+              </w:rPr>
+            </w:r>
+          </w:p>
+        </w:tc>
+        <w:tc>
+          <w:tcPr>
+            <w:tcW w:type="dxa" w:w="5623"/>
+            <w:tcBorders>
+              <w:top w:val="single" w:color="D9D4CA" w:sz="4"/>
+              <w:left w:val="single" w:color="D9D4CA" w:sz="4"/>
+              <w:bottom w:val="single" w:color="D9D4CA" w:sz="4"/>
+              <w:right w:val="single" w:color="D9D4CA" w:sz="4"/>
+            </w:tcBorders>
+            <w:tcMar>
+              <w:top w:type="dxa" w:w="60"/>
+              <w:left w:type="dxa" w:w="80"/>
+              <w:bottom w:type="dxa" w:w="60"/>
+              <w:right w:type="dxa" w:w="80"/>
+            </w:tcMar>
+          </w:tcPr>
+          <w:p>
+            <w:r>
+              <w:rPr>
+                <w:rFonts w:ascii="Calibri" w:cs="Calibri" w:eastAsia="Calibri" w:hAnsi="Calibri"/>
+                <w:b w:val="false"/>
+                <w:bCs w:val="false"/>
+                <w:i w:val="false"/>
+                <w:iCs w:val="false"/>
+                <w:sz w:val="19"/>
+                <w:szCs w:val="19"/>
+              </w:rPr>
+            </w:r>
+          </w:p>
+        </w:tc>
+      </w:tr>
+      <w:tr>
+        <w:tc>
+          <w:tcPr>
+            <w:tcW w:type="dxa" w:w="803"/>
+            <w:tcBorders>
+              <w:top w:val="single" w:color="D9D4CA" w:sz="4"/>
+              <w:left w:val="single" w:color="D9D4CA" w:sz="4"/>
+              <w:bottom w:val="single" w:color="D9D4CA" w:sz="4"/>
+              <w:right w:val="single" w:color="D9D4CA" w:sz="4"/>
+            </w:tcBorders>
+            <w:tcMar>
+              <w:top w:type="dxa" w:w="60"/>
+              <w:left w:type="dxa" w:w="80"/>
+              <w:bottom w:type="dxa" w:w="60"/>
+              <w:right w:type="dxa" w:w="80"/>
+            </w:tcMar>
+          </w:tcPr>
+          <w:p>
+            <w:r>
+              <w:rPr>
+                <w:rFonts w:ascii="Calibri" w:cs="Calibri" w:eastAsia="Calibri" w:hAnsi="Calibri"/>
+                <w:b w:val="false"/>
+                <w:bCs w:val="false"/>
+                <w:i w:val="false"/>
+                <w:iCs w:val="false"/>
+                <w:sz w:val="19"/>
+                <w:szCs w:val="19"/>
+              </w:rPr>
+              <w:t>9</w:t>
+            </w:r>
+          </w:p>
+        </w:tc>
+        <w:tc>
+          <w:tcPr>
+            <w:tcW w:type="dxa" w:w="3212"/>
+            <w:tcBorders>
+              <w:top w:val="single" w:color="D9D4CA" w:sz="4"/>
+              <w:left w:val="single" w:color="D9D4CA" w:sz="4"/>
+              <w:bottom w:val="single" w:color="D9D4CA" w:sz="4"/>
+              <w:right w:val="single" w:color="D9D4CA" w:sz="4"/>
+            </w:tcBorders>
+            <w:tcMar>
+              <w:top w:type="dxa" w:w="60"/>
+              <w:left w:type="dxa" w:w="80"/>
+              <w:bottom w:type="dxa" w:w="60"/>
+              <w:right w:type="dxa" w:w="80"/>
+            </w:tcMar>
+          </w:tcPr>
+          <w:p>
+            <w:r>
+              <w:rPr>
+                <w:rFonts w:ascii="Calibri" w:cs="Calibri" w:eastAsia="Calibri" w:hAnsi="Calibri"/>
+                <w:b w:val="false"/>
+                <w:bCs w:val="false"/>
+                <w:i w:val="false"/>
+                <w:iCs w:val="false"/>
+                <w:sz w:val="19"/>
+                <w:szCs w:val="19"/>
+              </w:rPr>
+            </w:r>
+          </w:p>
+        </w:tc>
+        <w:tc>
+          <w:tcPr>
+            <w:tcW w:type="dxa" w:w="5623"/>
+            <w:tcBorders>
+              <w:top w:val="single" w:color="D9D4CA" w:sz="4"/>
+              <w:left w:val="single" w:color="D9D4CA" w:sz="4"/>
+              <w:bottom w:val="single" w:color="D9D4CA" w:sz="4"/>
+              <w:right w:val="single" w:color="D9D4CA" w:sz="4"/>
+            </w:tcBorders>
+            <w:tcMar>
+              <w:top w:type="dxa" w:w="60"/>
+              <w:left w:type="dxa" w:w="80"/>
+              <w:bottom w:type="dxa" w:w="60"/>
+              <w:right w:type="dxa" w:w="80"/>
+            </w:tcMar>
+          </w:tcPr>
+          <w:p>
+            <w:r>
+              <w:rPr>
+                <w:rFonts w:ascii="Calibri" w:cs="Calibri" w:eastAsia="Calibri" w:hAnsi="Calibri"/>
+                <w:b w:val="false"/>
+                <w:bCs w:val="false"/>
+                <w:i w:val="false"/>
+                <w:iCs w:val="false"/>
+                <w:sz w:val="19"/>
+                <w:szCs w:val="19"/>
+              </w:rPr>
+            </w:r>
+          </w:p>
+        </w:tc>
+      </w:tr>
+      <w:tr>
+        <w:tc>
+          <w:tcPr>
+            <w:tcW w:type="dxa" w:w="803"/>
+            <w:tcBorders>
+              <w:top w:val="single" w:color="D9D4CA" w:sz="4"/>
+              <w:left w:val="single" w:color="D9D4CA" w:sz="4"/>
+              <w:bottom w:val="single" w:color="D9D4CA" w:sz="4"/>
+              <w:right w:val="single" w:color="D9D4CA" w:sz="4"/>
+            </w:tcBorders>
+            <w:tcMar>
+              <w:top w:type="dxa" w:w="60"/>
+              <w:left w:type="dxa" w:w="80"/>
+              <w:bottom w:type="dxa" w:w="60"/>
+              <w:right w:type="dxa" w:w="80"/>
+            </w:tcMar>
+          </w:tcPr>
+          <w:p>
+            <w:r>
+              <w:rPr>
+                <w:rFonts w:ascii="Calibri" w:cs="Calibri" w:eastAsia="Calibri" w:hAnsi="Calibri"/>
+                <w:b w:val="false"/>
+                <w:bCs w:val="false"/>
+                <w:i w:val="false"/>
+                <w:iCs w:val="false"/>
+                <w:sz w:val="19"/>
+                <w:szCs w:val="19"/>
+              </w:rPr>
+              <w:t>10</w:t>
+            </w:r>
+          </w:p>
+        </w:tc>
+        <w:tc>
+          <w:tcPr>
+            <w:tcW w:type="dxa" w:w="3212"/>
+            <w:tcBorders>
+              <w:top w:val="single" w:color="D9D4CA" w:sz="4"/>
+              <w:left w:val="single" w:color="D9D4CA" w:sz="4"/>
+              <w:bottom w:val="single" w:color="D9D4CA" w:sz="4"/>
+              <w:right w:val="single" w:color="D9D4CA" w:sz="4"/>
+            </w:tcBorders>
+            <w:tcMar>
+              <w:top w:type="dxa" w:w="60"/>
+              <w:left w:type="dxa" w:w="80"/>
+              <w:bottom w:type="dxa" w:w="60"/>
+              <w:right w:type="dxa" w:w="80"/>
+            </w:tcMar>
+          </w:tcPr>
+          <w:p>
+            <w:r>
+              <w:rPr>
+                <w:rFonts w:ascii="Calibri" w:cs="Calibri" w:eastAsia="Calibri" w:hAnsi="Calibri"/>
+                <w:b w:val="false"/>
+                <w:bCs w:val="false"/>
+                <w:i w:val="false"/>
+                <w:iCs w:val="false"/>
+                <w:sz w:val="19"/>
+                <w:szCs w:val="19"/>
+              </w:rPr>
+            </w:r>
+          </w:p>
+        </w:tc>
+        <w:tc>
+          <w:tcPr>
+            <w:tcW w:type="dxa" w:w="5623"/>
+            <w:tcBorders>
+              <w:top w:val="single" w:color="D9D4CA" w:sz="4"/>
+              <w:left w:val="single" w:color="D9D4CA" w:sz="4"/>
+              <w:bottom w:val="single" w:color="D9D4CA" w:sz="4"/>
+              <w:right w:val="single" w:color="D9D4CA" w:sz="4"/>
+            </w:tcBorders>
+            <w:tcMar>
+              <w:top w:type="dxa" w:w="60"/>
+              <w:left w:type="dxa" w:w="80"/>
+              <w:bottom w:type="dxa" w:w="60"/>
+              <w:right w:type="dxa" w:w="80"/>
+            </w:tcMar>
+          </w:tcPr>
+          <w:p>
+            <w:r>
+              <w:rPr>
+                <w:rFonts w:ascii="Calibri" w:cs="Calibri" w:eastAsia="Calibri" w:hAnsi="Calibri"/>
+                <w:b w:val="false"/>
+                <w:bCs w:val="false"/>
+                <w:i w:val="false"/>
+                <w:iCs w:val="false"/>
+                <w:sz w:val="19"/>
+                <w:szCs w:val="19"/>
+              </w:rPr>
+            </w:r>
+          </w:p>
+        </w:tc>
+      </w:tr>
+      <w:tr>
+        <w:tc>
+          <w:tcPr>
+            <w:tcW w:type="dxa" w:w="803"/>
+            <w:tcBorders>
+              <w:top w:val="single" w:color="D9D4CA" w:sz="4"/>
+              <w:left w:val="single" w:color="D9D4CA" w:sz="4"/>
+              <w:bottom w:val="single" w:color="D9D4CA" w:sz="4"/>
+              <w:right w:val="single" w:color="D9D4CA" w:sz="4"/>
+            </w:tcBorders>
+            <w:tcMar>
+              <w:top w:type="dxa" w:w="60"/>
+              <w:left w:type="dxa" w:w="80"/>
+              <w:bottom w:type="dxa" w:w="60"/>
+              <w:right w:type="dxa" w:w="80"/>
+            </w:tcMar>
+          </w:tcPr>
+          <w:p>
+            <w:r>
+              <w:rPr>
+                <w:rFonts w:ascii="Calibri" w:cs="Calibri" w:eastAsia="Calibri" w:hAnsi="Calibri"/>
+                <w:b w:val="false"/>
+                <w:bCs w:val="false"/>
+                <w:i w:val="false"/>
+                <w:iCs w:val="false"/>
+                <w:sz w:val="19"/>
+                <w:szCs w:val="19"/>
+              </w:rPr>
+              <w:t>11</w:t>
+            </w:r>
+          </w:p>
+        </w:tc>
+        <w:tc>
+          <w:tcPr>
+            <w:tcW w:type="dxa" w:w="3212"/>
+            <w:tcBorders>
+              <w:top w:val="single" w:color="D9D4CA" w:sz="4"/>
+              <w:left w:val="single" w:color="D9D4CA" w:sz="4"/>
+              <w:bottom w:val="single" w:color="D9D4CA" w:sz="4"/>
+              <w:right w:val="single" w:color="D9D4CA" w:sz="4"/>
+            </w:tcBorders>
+            <w:tcMar>
+              <w:top w:type="dxa" w:w="60"/>
+              <w:left w:type="dxa" w:w="80"/>
+              <w:bottom w:type="dxa" w:w="60"/>
+              <w:right w:type="dxa" w:w="80"/>
+            </w:tcMar>
+          </w:tcPr>
+          <w:p>
+            <w:r>
+              <w:rPr>
+                <w:rFonts w:ascii="Calibri" w:cs="Calibri" w:eastAsia="Calibri" w:hAnsi="Calibri"/>
+                <w:b w:val="false"/>
+                <w:bCs w:val="false"/>
+                <w:i w:val="false"/>
+                <w:iCs w:val="false"/>
+                <w:sz w:val="19"/>
+                <w:szCs w:val="19"/>
+              </w:rPr>
+            </w:r>
+          </w:p>
+        </w:tc>
+        <w:tc>
+          <w:tcPr>
+            <w:tcW w:type="dxa" w:w="5623"/>
+            <w:tcBorders>
+              <w:top w:val="single" w:color="D9D4CA" w:sz="4"/>
+              <w:left w:val="single" w:color="D9D4CA" w:sz="4"/>
+              <w:bottom w:val="single" w:color="D9D4CA" w:sz="4"/>
+              <w:right w:val="single" w:color="D9D4CA" w:sz="4"/>
+            </w:tcBorders>
+            <w:tcMar>
+              <w:top w:type="dxa" w:w="60"/>
+              <w:left w:type="dxa" w:w="80"/>
+              <w:bottom w:type="dxa" w:w="60"/>
+              <w:right w:type="dxa" w:w="80"/>
+            </w:tcMar>
+          </w:tcPr>
+          <w:p>
+            <w:r>
+              <w:rPr>
+                <w:rFonts w:ascii="Calibri" w:cs="Calibri" w:eastAsia="Calibri" w:hAnsi="Calibri"/>
+                <w:b w:val="false"/>
+                <w:bCs w:val="false"/>
+                <w:i w:val="false"/>
+                <w:iCs w:val="false"/>
+                <w:sz w:val="19"/>
+                <w:szCs w:val="19"/>
+              </w:rPr>
+            </w:r>
+          </w:p>
+        </w:tc>
+      </w:tr>
+      <w:tr>
+        <w:tc>
+          <w:tcPr>
+            <w:tcW w:type="dxa" w:w="803"/>
+            <w:tcBorders>
+              <w:top w:val="single" w:color="D9D4CA" w:sz="4"/>
+              <w:left w:val="single" w:color="D9D4CA" w:sz="4"/>
+              <w:bottom w:val="single" w:color="D9D4CA" w:sz="4"/>
+              <w:right w:val="single" w:color="D9D4CA" w:sz="4"/>
+            </w:tcBorders>
+            <w:tcMar>
+              <w:top w:type="dxa" w:w="60"/>
+              <w:left w:type="dxa" w:w="80"/>
+              <w:bottom w:type="dxa" w:w="60"/>
+              <w:right w:type="dxa" w:w="80"/>
+            </w:tcMar>
+          </w:tcPr>
+          <w:p>
+            <w:r>
+              <w:rPr>
+                <w:rFonts w:ascii="Calibri" w:cs="Calibri" w:eastAsia="Calibri" w:hAnsi="Calibri"/>
+                <w:b w:val="false"/>
+                <w:bCs w:val="false"/>
+                <w:i w:val="false"/>
+                <w:iCs w:val="false"/>
+                <w:sz w:val="19"/>
+                <w:szCs w:val="19"/>
+              </w:rPr>
+              <w:t>12</w:t>
             </w:r>
           </w:p>
         </w:tc>

</xml_diff>